<commit_message>
Fix demo transcription spelling (הפונקצייה, as printed in the source)
Found by a word-level diff of the transcription against the PDF text layer.

Co-Authored-By: Claude Opus 5.5 <noreply@anthropic.com>
Claude-Session: https://claude.ai/code/session_01KTgCJmtP8QToV87hPt2rao
</commit_message>
<xml_diff>
--- a/examples/demo_new1_p3.docx
+++ b/examples/demo_new1_p3.docx
@@ -50,7 +50,7 @@
               <w:rPr>
                 <w:rtl/>
               </w:rPr>
-              <w:t xml:space="preserve">בסרטוט שלפניכם מתואר גרף הפונקציה </w:t>
+              <w:t xml:space="preserve">בסרטוט שלפניכם מתואר גרף הפונקצייה </w:t>
             </w:r>
             <m:oMath>
               <m:r>
@@ -85,7 +85,7 @@
               <w:rPr>
                 <w:rtl/>
               </w:rPr>
-              <w:t xml:space="preserve">כל שיעורי נקודות החיתוך של גרף הפונקציה </w:t>
+              <w:t xml:space="preserve">כל שיעורי נקודות החיתוך של גרף הפונקצייה </w:t>
             </w:r>
             <m:oMath>
               <m:r>
@@ -134,7 +134,7 @@
               <w:rPr>
                 <w:rtl/>
               </w:rPr>
-              <w:t xml:space="preserve">הפונקציה  מוגדרת לכל </w:t>
+              <w:t xml:space="preserve">הפונקצייה  מוגדרת לכל </w:t>
             </w:r>
             <m:oMath>
               <m:r>
@@ -381,7 +381,7 @@
               <w:rPr>
                 <w:rtl/>
               </w:rPr>
-              <w:t xml:space="preserve">את שיעורי נקודת המקסימום של הפונקציה </w:t>
+              <w:t xml:space="preserve">את שיעורי נקודת המקסימום של הפונקצייה </w:t>
             </w:r>
             <m:oMath>
               <m:r>
@@ -481,8 +481,8 @@
         <w:rPr>
           <w:b/>
           <w:bCs/>
-          <w:sz w:val="21"/>
-          <w:szCs w:val="21"/>
+          <w:sz w:val="20"/>
+          <w:szCs w:val="20"/>
           <w:rtl/>
         </w:rPr>
         <w:t>(2)</w:t>
@@ -492,8 +492,8 @@
       </w:r>
       <w:r>
         <w:rPr>
-          <w:sz w:val="21"/>
-          <w:szCs w:val="21"/>
+          <w:sz w:val="20"/>
+          <w:szCs w:val="20"/>
           <w:rtl/>
         </w:rPr>
         <w:t xml:space="preserve">הביעו באמצעות </w:t>
@@ -501,25 +501,25 @@
       <m:oMath>
         <m:r>
           <w:rPr>
-            <w:sz w:val="21"/>
-            <w:szCs w:val="21"/>
+            <w:sz w:val="20"/>
+            <w:szCs w:val="20"/>
           </w:rPr>
           <m:t>m</m:t>
         </m:r>
       </m:oMath>
       <w:r>
         <w:rPr>
-          <w:sz w:val="21"/>
-          <w:szCs w:val="21"/>
+          <w:sz w:val="20"/>
+          <w:szCs w:val="20"/>
           <w:rtl/>
         </w:rPr>
-        <w:t xml:space="preserve"> , אם יש צורך, את שיעורי נקודות הקיצון של הפונקציה </w:t>
+        <w:t xml:space="preserve"> , אם יש צורך, את שיעורי נקודות הקיצון של הפונקצייה </w:t>
       </w:r>
       <m:oMath>
         <m:r>
           <w:rPr>
-            <w:sz w:val="21"/>
-            <w:szCs w:val="21"/>
+            <w:sz w:val="20"/>
+            <w:szCs w:val="20"/>
           </w:rPr>
           <m:t>h</m:t>
         </m:r>
@@ -528,15 +528,15 @@
             <m:sty m:val="p"/>
           </m:rPr>
           <w:rPr>
-            <w:sz w:val="21"/>
-            <w:szCs w:val="21"/>
+            <w:sz w:val="20"/>
+            <w:szCs w:val="20"/>
           </w:rPr>
           <m:t>(</m:t>
         </m:r>
         <m:r>
           <w:rPr>
-            <w:sz w:val="21"/>
-            <w:szCs w:val="21"/>
+            <w:sz w:val="20"/>
+            <w:szCs w:val="20"/>
           </w:rPr>
           <m:t>x</m:t>
         </m:r>
@@ -545,16 +545,16 @@
             <m:sty m:val="p"/>
           </m:rPr>
           <w:rPr>
-            <w:sz w:val="21"/>
-            <w:szCs w:val="21"/>
+            <w:sz w:val="20"/>
+            <w:szCs w:val="20"/>
           </w:rPr>
           <m:t>)</m:t>
         </m:r>
       </m:oMath>
       <w:r>
         <w:rPr>
-          <w:sz w:val="21"/>
-          <w:szCs w:val="21"/>
+          <w:sz w:val="20"/>
+          <w:szCs w:val="20"/>
           <w:rtl/>
         </w:rPr>
         <w:t xml:space="preserve"> , וקבעו את סוגן.</w:t>

</xml_diff>